<commit_message>
chore: Node 22 → 24 LTS no CI e na imagem Docker
- NODE_VERSION 24 no ci.yml; node:24-alpine no Dockerfile (suporte até
  2028-04-30); docs e skill atualizadas; STATUS registra os 3 passos

Co-Authored-By: Claude Opus 5.5 <noreply@anthropic.com>
</commit_message>
<xml_diff>
--- a/docs/ROTEIRO_CICD_CLAUDE_CODE.docx
+++ b/docs/ROTEIRO_CICD_CLAUDE_CODE.docx
@@ -152,7 +152,7 @@
         </w:numPr>
       </w:pPr>
       <w:r>
-        <w:t xml:space="preserve">Node.js 22+ e Python 3.13+ instalados (compatível com o que já roda localmente).</w:t>
+        <w:t xml:space="preserve">Node.js 24+ (LTS) e Python 3.13+ instalados (compatível com o que já roda localmente).</w:t>
       </w:r>
     </w:p>
     <w:p>
@@ -851,7 +851,7 @@
               <w:rPr>
                 <w:rStyle w:val="VerbatimChar"/>
               </w:rPr>
-              <w:t xml:space="preserve">.eslintrc.json</w:t>
+              <w:t xml:space="preserve">eslint.config.js</w:t>
             </w:r>
           </w:p>
         </w:tc>
@@ -869,6 +869,18 @@
                 <w:rStyle w:val="VerbatimChar"/>
               </w:rPr>
               <w:t xml:space="preserve">src/**/*.js</w:t>
+            </w:r>
+            <w:r>
+              <w:t xml:space="preserve">), formato flat config do ESLint 9+ (antes era</w:t>
+            </w:r>
+            <w:r>
+              <w:t xml:space="preserve"> </w:t>
+            </w:r>
+            <w:r>
+              <w:rPr>
+                <w:rStyle w:val="VerbatimChar"/>
+              </w:rPr>
+              <w:t xml:space="preserve">.eslintrc.json</w:t>
             </w:r>
             <w:r>
               <w:t xml:space="preserve">)</w:t>

</xml_diff>